<commit_message>
MVP final docs: decoupling, GAP-1 backport, QA bank/ledger alignment, OpenDesign source consistency, round-2 review closure
</commit_message>
<xml_diff>
--- a/docs/research/mvp/final/00-product-scope-and-principles.docx
+++ b/docs/research/mvp/final/00-product-scope-and-principles.docx
@@ -10,7 +10,7 @@
         <w:t xml:space="preserve">Product Definition, Scope, Roles &amp; Principles</w:t>
       </w:r>
     </w:p>
-    <w:bookmarkStart w:id="59" w:name="X4b5a5fc3d549fdbcc23b72b886e9d5794619717"/>
+    <w:bookmarkStart w:id="74" w:name="X4b5a5fc3d549fdbcc23b72b886e9d5794619717"/>
     <w:p>
       <w:pPr>
         <w:pStyle w:val="Heading1"/>
@@ -753,7 +753,7 @@
       </w:r>
     </w:p>
     <w:bookmarkEnd w:id="9"/>
-    <w:bookmarkStart w:id="11" w:name="X9bf6b1f79e88336ff46677e09712bd81f87c539"/>
+    <w:bookmarkStart w:id="14" w:name="X9bf6b1f79e88336ff46677e09712bd81f87c539"/>
     <w:p>
       <w:pPr>
         <w:pStyle w:val="Heading2"/>
@@ -1471,11 +1471,46 @@
         <w:pStyle w:val="FirstParagraph"/>
       </w:pPr>
       <w:r>
-        <w:rPr>
-          <w:b/>
-          <w:bCs/>
-        </w:rPr>
-        <w:t xml:space="preserve">[MERMAID RENDER FAILED — block #1]</w:t>
+        <w:drawing>
+          <wp:inline>
+            <wp:extent cx="5334000" cy="4742089"/>
+            <wp:effectExtent b="0" l="0" r="0" t="0"/>
+            <wp:docPr descr="diagram" title="" id="12" name="Picture"/>
+            <a:graphic>
+              <a:graphicData uri="http://schemas.openxmlformats.org/drawingml/2006/picture">
+                <pic:pic>
+                  <pic:nvPicPr>
+                    <pic:cNvPr descr="/tmp/.private/milosvasic/tmp.gptM01fOlL/img/diagram_001_6d6b45b773c7.png" id="13" name="Picture"/>
+                    <pic:cNvPicPr>
+                      <a:picLocks noChangeArrowheads="1" noChangeAspect="1"/>
+                    </pic:cNvPicPr>
+                  </pic:nvPicPr>
+                  <pic:blipFill>
+                    <a:blip r:embed="rId11"/>
+                    <a:stretch>
+                      <a:fillRect/>
+                    </a:stretch>
+                  </pic:blipFill>
+                  <pic:spPr bwMode="auto">
+                    <a:xfrm>
+                      <a:off x="0" y="0"/>
+                      <a:ext cx="5334000" cy="4742089"/>
+                    </a:xfrm>
+                    <a:prstGeom prst="rect">
+                      <a:avLst/>
+                    </a:prstGeom>
+                    <a:noFill/>
+                    <a:ln w="9525">
+                      <a:noFill/>
+                      <a:headEnd/>
+                      <a:tailEnd/>
+                    </a:ln>
+                  </pic:spPr>
+                </pic:pic>
+              </a:graphicData>
+            </a:graphic>
+          </wp:inline>
+        </w:drawing>
       </w:r>
     </w:p>
     <w:p>
@@ -1485,8 +1520,8 @@
         </w:pict>
       </w:r>
     </w:p>
-    <w:bookmarkEnd w:id="11"/>
-    <w:bookmarkStart w:id="14" w:name="X09f2ebffc9cb579226ae4212bd5300a843a0d16"/>
+    <w:bookmarkEnd w:id="14"/>
+    <w:bookmarkStart w:id="17" w:name="X09f2ebffc9cb579226ae4212bd5300a843a0d16"/>
     <w:p>
       <w:pPr>
         <w:pStyle w:val="Heading2"/>
@@ -1509,7 +1544,7 @@
         <w:t xml:space="preserve">keeps every downstream document from drifting into adjacent products.</w:t>
       </w:r>
     </w:p>
-    <w:bookmarkStart w:id="12" w:name="X82f8664ffbbfb19a52669298dd4761a93e8130a"/>
+    <w:bookmarkStart w:id="15" w:name="X82f8664ffbbfb19a52669298dd4761a93e8130a"/>
     <w:p>
       <w:pPr>
         <w:pStyle w:val="Heading3"/>
@@ -1858,8 +1893,8 @@
         <w:t xml:space="preserve">.</w:t>
       </w:r>
     </w:p>
-    <w:bookmarkEnd w:id="12"/>
-    <w:bookmarkStart w:id="13" w:name="X65e045eb282c490a64a493794a6376dcced0f57"/>
+    <w:bookmarkEnd w:id="15"/>
+    <w:bookmarkStart w:id="16" w:name="X65e045eb282c490a64a493794a6376dcced0f57"/>
     <w:p>
       <w:pPr>
         <w:pStyle w:val="Heading3"/>
@@ -2518,9 +2553,9 @@
         </w:pict>
       </w:r>
     </w:p>
-    <w:bookmarkEnd w:id="13"/>
-    <w:bookmarkEnd w:id="14"/>
-    <w:bookmarkStart w:id="19" w:name="X48d1823b72cb0d31d1c2e915c001092950da830"/>
+    <w:bookmarkEnd w:id="16"/>
+    <w:bookmarkEnd w:id="17"/>
+    <w:bookmarkStart w:id="25" w:name="X48d1823b72cb0d31d1c2e915c001092950da830"/>
     <w:p>
       <w:pPr>
         <w:pStyle w:val="Heading2"/>
@@ -2566,14 +2601,49 @@
         <w:pStyle w:val="BodyText"/>
       </w:pPr>
       <w:r>
-        <w:rPr>
-          <w:b/>
-          <w:bCs/>
-        </w:rPr>
-        <w:t xml:space="preserve">[MERMAID RENDER FAILED — block #2]</w:t>
-      </w:r>
-    </w:p>
-    <w:bookmarkStart w:id="15" w:name="Xcaaf90db5125f94428e37bccdd201eb98fb0414"/>
+        <w:drawing>
+          <wp:inline>
+            <wp:extent cx="5334000" cy="1911803"/>
+            <wp:effectExtent b="0" l="0" r="0" t="0"/>
+            <wp:docPr descr="diagram" title="" id="19" name="Picture"/>
+            <a:graphic>
+              <a:graphicData uri="http://schemas.openxmlformats.org/drawingml/2006/picture">
+                <pic:pic>
+                  <pic:nvPicPr>
+                    <pic:cNvPr descr="/tmp/.private/milosvasic/tmp.gptM01fOlL/img/diagram_002_dc7faf068f22.png" id="20" name="Picture"/>
+                    <pic:cNvPicPr>
+                      <a:picLocks noChangeArrowheads="1" noChangeAspect="1"/>
+                    </pic:cNvPicPr>
+                  </pic:nvPicPr>
+                  <pic:blipFill>
+                    <a:blip r:embed="rId18"/>
+                    <a:stretch>
+                      <a:fillRect/>
+                    </a:stretch>
+                  </pic:blipFill>
+                  <pic:spPr bwMode="auto">
+                    <a:xfrm>
+                      <a:off x="0" y="0"/>
+                      <a:ext cx="5334000" cy="1911803"/>
+                    </a:xfrm>
+                    <a:prstGeom prst="rect">
+                      <a:avLst/>
+                    </a:prstGeom>
+                    <a:noFill/>
+                    <a:ln w="9525">
+                      <a:noFill/>
+                      <a:headEnd/>
+                      <a:tailEnd/>
+                    </a:ln>
+                  </pic:spPr>
+                </pic:pic>
+              </a:graphicData>
+            </a:graphic>
+          </wp:inline>
+        </w:drawing>
+      </w:r>
+    </w:p>
+    <w:bookmarkStart w:id="21" w:name="Xcaaf90db5125f94428e37bccdd201eb98fb0414"/>
     <w:p>
       <w:pPr>
         <w:pStyle w:val="Heading3"/>
@@ -2853,8 +2923,8 @@
         <w:t xml:space="preserve">.</w:t>
       </w:r>
     </w:p>
-    <w:bookmarkEnd w:id="15"/>
-    <w:bookmarkStart w:id="16" w:name="X357c6d544f1d5b74782dbe16d44cbebf6fc7a12"/>
+    <w:bookmarkEnd w:id="21"/>
+    <w:bookmarkStart w:id="22" w:name="X357c6d544f1d5b74782dbe16d44cbebf6fc7a12"/>
     <w:p>
       <w:pPr>
         <w:pStyle w:val="Heading3"/>
@@ -2983,8 +3053,8 @@
         <w:t xml:space="preserve">.</w:t>
       </w:r>
     </w:p>
-    <w:bookmarkEnd w:id="16"/>
-    <w:bookmarkStart w:id="17" w:name="X3fae26169f547fb8be1b8772da3ce6e78dfe0ac"/>
+    <w:bookmarkEnd w:id="22"/>
+    <w:bookmarkStart w:id="23" w:name="X3fae26169f547fb8be1b8772da3ce6e78dfe0ac"/>
     <w:p>
       <w:pPr>
         <w:pStyle w:val="Heading3"/>
@@ -3130,8 +3200,8 @@
         <w:t xml:space="preserve">tunnel shim.</w:t>
       </w:r>
     </w:p>
-    <w:bookmarkEnd w:id="17"/>
-    <w:bookmarkStart w:id="18" w:name="Xff4e2e614f7a5842ae7fac374cec10efa9c7b15"/>
+    <w:bookmarkEnd w:id="23"/>
+    <w:bookmarkStart w:id="24" w:name="Xff4e2e614f7a5842ae7fac374cec10efa9c7b15"/>
     <w:p>
       <w:pPr>
         <w:pStyle w:val="Heading3"/>
@@ -3433,9 +3503,9 @@
         </w:pict>
       </w:r>
     </w:p>
-    <w:bookmarkEnd w:id="18"/>
-    <w:bookmarkEnd w:id="19"/>
-    <w:bookmarkStart w:id="22" w:name="X96ec4da555603716c4badd51d2d43de70b62f10"/>
+    <w:bookmarkEnd w:id="24"/>
+    <w:bookmarkEnd w:id="25"/>
+    <w:bookmarkStart w:id="31" w:name="X96ec4da555603716c4badd51d2d43de70b62f10"/>
     <w:p>
       <w:pPr>
         <w:pStyle w:val="Heading2"/>
@@ -3513,7 +3583,7 @@
         <w:t xml:space="preserve">engineering meaning:</w:t>
       </w:r>
     </w:p>
-    <w:bookmarkStart w:id="20" w:name="Xd5610d2f86ad0bf090295117bf30916f6472c44"/>
+    <w:bookmarkStart w:id="29" w:name="Xd5610d2f86ad0bf090295117bf30916f6472c44"/>
     <w:p>
       <w:pPr>
         <w:pStyle w:val="Heading3"/>
@@ -3561,19 +3631,70 @@
         <w:pStyle w:val="BodyText"/>
       </w:pPr>
       <w:r>
+        <w:drawing>
+          <wp:inline>
+            <wp:extent cx="5334000" cy="3082017"/>
+            <wp:effectExtent b="0" l="0" r="0" t="0"/>
+            <wp:docPr descr="diagram" title="" id="27" name="Picture"/>
+            <a:graphic>
+              <a:graphicData uri="http://schemas.openxmlformats.org/drawingml/2006/picture">
+                <pic:pic>
+                  <pic:nvPicPr>
+                    <pic:cNvPr descr="/tmp/.private/milosvasic/tmp.gptM01fOlL/img/diagram_003_960ae0617a28.png" id="28" name="Picture"/>
+                    <pic:cNvPicPr>
+                      <a:picLocks noChangeArrowheads="1" noChangeAspect="1"/>
+                    </pic:cNvPicPr>
+                  </pic:nvPicPr>
+                  <pic:blipFill>
+                    <a:blip r:embed="rId26"/>
+                    <a:stretch>
+                      <a:fillRect/>
+                    </a:stretch>
+                  </pic:blipFill>
+                  <pic:spPr bwMode="auto">
+                    <a:xfrm>
+                      <a:off x="0" y="0"/>
+                      <a:ext cx="5334000" cy="3082017"/>
+                    </a:xfrm>
+                    <a:prstGeom prst="rect">
+                      <a:avLst/>
+                    </a:prstGeom>
+                    <a:noFill/>
+                    <a:ln w="9525">
+                      <a:noFill/>
+                      <a:headEnd/>
+                      <a:tailEnd/>
+                    </a:ln>
+                  </pic:spPr>
+                </pic:pic>
+              </a:graphicData>
+            </a:graphic>
+          </wp:inline>
+        </w:drawing>
+      </w:r>
+    </w:p>
+    <w:p>
+      <w:pPr>
+        <w:pStyle w:val="BodyText"/>
+      </w:pPr>
+      <w:r>
+        <w:t xml:space="preserve">The "two ways" are the</w:t>
+      </w:r>
+      <w:r>
+        <w:t xml:space="preserve"> </w:t>
+      </w:r>
+      <w:r>
         <w:rPr>
           <w:b/>
           <w:bCs/>
         </w:rPr>
-        <w:t xml:space="preserve">[MERMAID RENDER FAILED — block #3]</w:t>
-      </w:r>
-    </w:p>
-    <w:p>
-      <w:pPr>
-        <w:pStyle w:val="BodyText"/>
-      </w:pPr>
-      <w:r>
-        <w:t xml:space="preserve">The "two ways" are the</w:t>
+        <w:t xml:space="preserve">network-side leg</w:t>
+      </w:r>
+      <w:r>
+        <w:t xml:space="preserve"> </w:t>
+      </w:r>
+      <w:r>
+        <w:t xml:space="preserve">(Connector → Gateway) and the</w:t>
       </w:r>
       <w:r>
         <w:t xml:space="preserve"> </w:t>
@@ -3583,22 +3704,6 @@
           <w:b/>
           <w:bCs/>
         </w:rPr>
-        <w:t xml:space="preserve">network-side leg</w:t>
-      </w:r>
-      <w:r>
-        <w:t xml:space="preserve"> </w:t>
-      </w:r>
-      <w:r>
-        <w:t xml:space="preserve">(Connector → Gateway) and the</w:t>
-      </w:r>
-      <w:r>
-        <w:t xml:space="preserve"> </w:t>
-      </w:r>
-      <w:r>
-        <w:rPr>
-          <w:b/>
-          <w:bCs/>
-        </w:rPr>
         <w:t xml:space="preserve">user-side leg</w:t>
       </w:r>
       <w:r>
@@ -3642,8 +3747,8 @@
         <w:t xml:space="preserve">.</w:t>
       </w:r>
     </w:p>
-    <w:bookmarkEnd w:id="20"/>
-    <w:bookmarkStart w:id="21" w:name="X387024d7ad9483a5c52fa2f20810ee93c929c2c"/>
+    <w:bookmarkEnd w:id="29"/>
+    <w:bookmarkStart w:id="30" w:name="X387024d7ad9483a5c52fa2f20810ee93c929c2c"/>
     <w:p>
       <w:pPr>
         <w:pStyle w:val="Heading3"/>
@@ -3906,9 +4011,9 @@
         </w:pict>
       </w:r>
     </w:p>
-    <w:bookmarkEnd w:id="21"/>
-    <w:bookmarkEnd w:id="22"/>
-    <w:bookmarkStart w:id="25" w:name="X874de8ce136588cdae3bef644b1b50430eb11d3"/>
+    <w:bookmarkEnd w:id="30"/>
+    <w:bookmarkEnd w:id="31"/>
+    <w:bookmarkStart w:id="34" w:name="X874de8ce136588cdae3bef644b1b50430eb11d3"/>
     <w:p>
       <w:pPr>
         <w:pStyle w:val="Heading2"/>
@@ -4267,7 +4372,7 @@
         </w:tc>
       </w:tr>
     </w:tbl>
-    <w:bookmarkStart w:id="23" w:name="X9cf76dd7d5385eff946ca3dabe9f4a81723fc25"/>
+    <w:bookmarkStart w:id="32" w:name="X9cf76dd7d5385eff946ca3dabe9f4a81723fc25"/>
     <w:p>
       <w:pPr>
         <w:pStyle w:val="Heading3"/>
@@ -4452,8 +4557,8 @@
         <w:t xml:space="preserve">.</w:t>
       </w:r>
     </w:p>
-    <w:bookmarkEnd w:id="23"/>
-    <w:bookmarkStart w:id="24" w:name="X11fbe8aa5492edb5eacda2c523543a0c4e28c86"/>
+    <w:bookmarkEnd w:id="32"/>
+    <w:bookmarkStart w:id="33" w:name="X11fbe8aa5492edb5eacda2c523543a0c4e28c86"/>
     <w:p>
       <w:pPr>
         <w:pStyle w:val="Heading3"/>
@@ -4562,9 +4667,9 @@
         </w:pict>
       </w:r>
     </w:p>
-    <w:bookmarkEnd w:id="24"/>
-    <w:bookmarkEnd w:id="25"/>
-    <w:bookmarkStart w:id="26" w:name="Xf9b7f603440666cd910c4811ac350d5d136129a"/>
+    <w:bookmarkEnd w:id="33"/>
+    <w:bookmarkEnd w:id="34"/>
+    <w:bookmarkStart w:id="35" w:name="Xf9b7f603440666cd910c4811ac350d5d136129a"/>
     <w:p>
       <w:pPr>
         <w:pStyle w:val="Heading2"/>
@@ -5166,8 +5271,8 @@
         </w:pict>
       </w:r>
     </w:p>
-    <w:bookmarkEnd w:id="26"/>
-    <w:bookmarkStart w:id="30" w:name="Xd79d0834b415720df45ef4ace73bc005b86a6b1"/>
+    <w:bookmarkEnd w:id="35"/>
+    <w:bookmarkStart w:id="42" w:name="Xd79d0834b415720df45ef4ace73bc005b86a6b1"/>
     <w:p>
       <w:pPr>
         <w:pStyle w:val="Heading2"/>
@@ -5176,7 +5281,7 @@
         <w:t xml:space="preserve">7. Hosting model, licensing &amp; commercial stance</w:t>
       </w:r>
     </w:p>
-    <w:bookmarkStart w:id="27" w:name="X7568504f08927e876617844b9743ac9859e01bb"/>
+    <w:bookmarkStart w:id="39" w:name="X7568504f08927e876617844b9743ac9859e01bb"/>
     <w:p>
       <w:pPr>
         <w:pStyle w:val="Heading3"/>
@@ -5251,15 +5356,50 @@
         <w:pStyle w:val="BodyText"/>
       </w:pPr>
       <w:r>
-        <w:rPr>
-          <w:b/>
-          <w:bCs/>
-        </w:rPr>
-        <w:t xml:space="preserve">[MERMAID RENDER FAILED — block #4]</w:t>
-      </w:r>
-    </w:p>
-    <w:bookmarkEnd w:id="27"/>
-    <w:bookmarkStart w:id="28" w:name="X104f7cef8d1a670055d62df7bc9f34a59829198"/>
+        <w:drawing>
+          <wp:inline>
+            <wp:extent cx="5334000" cy="3816803"/>
+            <wp:effectExtent b="0" l="0" r="0" t="0"/>
+            <wp:docPr descr="diagram" title="" id="37" name="Picture"/>
+            <a:graphic>
+              <a:graphicData uri="http://schemas.openxmlformats.org/drawingml/2006/picture">
+                <pic:pic>
+                  <pic:nvPicPr>
+                    <pic:cNvPr descr="/tmp/.private/milosvasic/tmp.gptM01fOlL/img/diagram_004_93af730a1c0c.png" id="38" name="Picture"/>
+                    <pic:cNvPicPr>
+                      <a:picLocks noChangeArrowheads="1" noChangeAspect="1"/>
+                    </pic:cNvPicPr>
+                  </pic:nvPicPr>
+                  <pic:blipFill>
+                    <a:blip r:embed="rId36"/>
+                    <a:stretch>
+                      <a:fillRect/>
+                    </a:stretch>
+                  </pic:blipFill>
+                  <pic:spPr bwMode="auto">
+                    <a:xfrm>
+                      <a:off x="0" y="0"/>
+                      <a:ext cx="5334000" cy="3816803"/>
+                    </a:xfrm>
+                    <a:prstGeom prst="rect">
+                      <a:avLst/>
+                    </a:prstGeom>
+                    <a:noFill/>
+                    <a:ln w="9525">
+                      <a:noFill/>
+                      <a:headEnd/>
+                      <a:tailEnd/>
+                    </a:ln>
+                  </pic:spPr>
+                </pic:pic>
+              </a:graphicData>
+            </a:graphic>
+          </wp:inline>
+        </w:drawing>
+      </w:r>
+    </w:p>
+    <w:bookmarkEnd w:id="39"/>
+    <w:bookmarkStart w:id="40" w:name="X104f7cef8d1a670055d62df7bc9f34a59829198"/>
     <w:p>
       <w:pPr>
         <w:pStyle w:val="Heading3"/>
@@ -5898,8 +6038,8 @@
         <w:t xml:space="preserve">assumed license (§11.4.6).</w:t>
       </w:r>
     </w:p>
-    <w:bookmarkEnd w:id="28"/>
-    <w:bookmarkStart w:id="29" w:name="Xb6860ad59f3831580ea17d0cadaa5ec419dd84d"/>
+    <w:bookmarkEnd w:id="40"/>
+    <w:bookmarkStart w:id="41" w:name="Xb6860ad59f3831580ea17d0cadaa5ec419dd84d"/>
     <w:p>
       <w:pPr>
         <w:pStyle w:val="Heading3"/>
@@ -6006,9 +6146,9 @@
         </w:pict>
       </w:r>
     </w:p>
-    <w:bookmarkEnd w:id="29"/>
-    <w:bookmarkEnd w:id="30"/>
-    <w:bookmarkStart w:id="38" w:name="Xfc4780b1eea94c2c5cbf531c05d7467e106f890"/>
+    <w:bookmarkEnd w:id="41"/>
+    <w:bookmarkEnd w:id="42"/>
+    <w:bookmarkStart w:id="50" w:name="Xfc4780b1eea94c2c5cbf531c05d7467e106f890"/>
     <w:p>
       <w:pPr>
         <w:pStyle w:val="Heading2"/>
@@ -6068,7 +6208,7 @@
         <w:t xml:space="preserve">constitution inheritance rule §11.4.35).</w:t>
       </w:r>
     </w:p>
-    <w:bookmarkStart w:id="31" w:name="X254ac093b33cf025b290b2af0aa429b113f737a"/>
+    <w:bookmarkStart w:id="43" w:name="X254ac093b33cf025b290b2af0aa429b113f737a"/>
     <w:p>
       <w:pPr>
         <w:pStyle w:val="Heading3"/>
@@ -6201,8 +6341,8 @@
         <w:t xml:space="preserve">basis.</w:t>
       </w:r>
     </w:p>
-    <w:bookmarkEnd w:id="31"/>
-    <w:bookmarkStart w:id="32" w:name="Xb80c7c882e45f6566b43d841cb915991b21c426"/>
+    <w:bookmarkEnd w:id="43"/>
+    <w:bookmarkStart w:id="44" w:name="Xb80c7c882e45f6566b43d841cb915991b21c426"/>
     <w:p>
       <w:pPr>
         <w:pStyle w:val="Heading3"/>
@@ -6355,8 +6495,8 @@
         <w:t xml:space="preserve">trait — see D1) + CI lint forbidding edits to WG crypto.</w:t>
       </w:r>
     </w:p>
-    <w:bookmarkEnd w:id="32"/>
-    <w:bookmarkStart w:id="33" w:name="p3--outbound-only-from-edges"/>
+    <w:bookmarkEnd w:id="44"/>
+    <w:bookmarkStart w:id="45" w:name="p3--outbound-only-from-edges"/>
     <w:p>
       <w:pPr>
         <w:pStyle w:val="Heading3"/>
@@ -6454,8 +6594,8 @@
         <w:t xml:space="preserve">role that listens publicly.</w:t>
       </w:r>
     </w:p>
-    <w:bookmarkEnd w:id="33"/>
-    <w:bookmarkStart w:id="34" w:name="p4--push-dont-poll"/>
+    <w:bookmarkEnd w:id="45"/>
+    <w:bookmarkStart w:id="46" w:name="p4--push-dont-poll"/>
     <w:p>
       <w:pPr>
         <w:pStyle w:val="Heading3"/>
@@ -6611,8 +6751,8 @@
         <w:t xml:space="preserve">.</w:t>
       </w:r>
     </w:p>
-    <w:bookmarkEnd w:id="34"/>
-    <w:bookmarkStart w:id="35" w:name="X873edce4f098d736a5d65c09ecb115225982e6c"/>
+    <w:bookmarkEnd w:id="46"/>
+    <w:bookmarkStart w:id="47" w:name="X873edce4f098d736a5d65c09ecb115225982e6c"/>
     <w:p>
       <w:pPr>
         <w:pStyle w:val="Heading3"/>
@@ -6761,8 +6901,8 @@
         <w:t xml:space="preserve">pillars (Rust core / Flutter UI / schema-generated clients).</w:t>
       </w:r>
     </w:p>
-    <w:bookmarkEnd w:id="35"/>
-    <w:bookmarkStart w:id="36" w:name="X1426d97e91f3405c6acd49aca57b31334d29afd"/>
+    <w:bookmarkEnd w:id="47"/>
+    <w:bookmarkStart w:id="48" w:name="X1426d97e91f3405c6acd49aca57b31334d29afd"/>
     <w:p>
       <w:pPr>
         <w:pStyle w:val="Heading3"/>
@@ -6863,8 +7003,8 @@
         <w:t xml:space="preserve">deploy spec (Podman quadlets, §11.4.76 containers submodule, §11.4.161 rootless).</w:t>
       </w:r>
     </w:p>
-    <w:bookmarkEnd w:id="36"/>
-    <w:bookmarkStart w:id="37" w:name="p7--no-logging-by-construction"/>
+    <w:bookmarkEnd w:id="48"/>
+    <w:bookmarkStart w:id="49" w:name="p7--no-logging-by-construction"/>
     <w:p>
       <w:pPr>
         <w:pStyle w:val="Heading3"/>
@@ -7860,9 +8000,9 @@
         </w:pict>
       </w:r>
     </w:p>
-    <w:bookmarkEnd w:id="37"/>
-    <w:bookmarkEnd w:id="38"/>
-    <w:bookmarkStart w:id="39" w:name="Xfe07800be256a60840ab67cbe9381b0ff67c40b"/>
+    <w:bookmarkEnd w:id="49"/>
+    <w:bookmarkEnd w:id="50"/>
+    <w:bookmarkStart w:id="51" w:name="Xfe07800be256a60840ab67cbe9381b0ff67c40b"/>
     <w:p>
       <w:pPr>
         <w:pStyle w:val="Heading2"/>
@@ -9813,8 +9953,8 @@
         </w:pict>
       </w:r>
     </w:p>
-    <w:bookmarkEnd w:id="39"/>
-    <w:bookmarkStart w:id="44" w:name="X6c02ed19e4ad97d5010598961cbe21e21decf2b"/>
+    <w:bookmarkEnd w:id="51"/>
+    <w:bookmarkStart w:id="59" w:name="X6c02ed19e4ad97d5010598961cbe21e21decf2b"/>
     <w:p>
       <w:pPr>
         <w:pStyle w:val="Heading2"/>
@@ -9923,7 +10063,7 @@
         <w:t xml:space="preserve">.</w:t>
       </w:r>
     </w:p>
-    <w:bookmarkStart w:id="40" w:name="X8664662087a50f4e42656e6b203080db23da729"/>
+    <w:bookmarkStart w:id="52" w:name="X8664662087a50f4e42656e6b203080db23da729"/>
     <w:p>
       <w:pPr>
         <w:pStyle w:val="Heading3"/>
@@ -10443,8 +10583,8 @@
         <w:t xml:space="preserve">.</w:t>
       </w:r>
     </w:p>
-    <w:bookmarkEnd w:id="40"/>
-    <w:bookmarkStart w:id="41" w:name="Xc3af385aa2e76e87ff7d64ed0bed866af5659c1"/>
+    <w:bookmarkEnd w:id="52"/>
+    <w:bookmarkStart w:id="53" w:name="Xc3af385aa2e76e87ff7d64ed0bed866af5659c1"/>
     <w:p>
       <w:pPr>
         <w:pStyle w:val="Heading3"/>
@@ -11050,8 +11190,8 @@
         <w:t xml:space="preserve">apps drive the system.</w:t>
       </w:r>
     </w:p>
-    <w:bookmarkEnd w:id="41"/>
-    <w:bookmarkStart w:id="42" w:name="X9694e0e631479937f0e760f254a0e0ce2c112b7"/>
+    <w:bookmarkEnd w:id="53"/>
+    <w:bookmarkStart w:id="54" w:name="X9694e0e631479937f0e760f254a0e0ce2c112b7"/>
     <w:p>
       <w:pPr>
         <w:pStyle w:val="Heading3"/>
@@ -11247,8 +11387,8 @@
         <w:t xml:space="preserve">HarmonyOS/Aurora/WASM (→P3); managed billing (→P3).</w:t>
       </w:r>
     </w:p>
-    <w:bookmarkEnd w:id="42"/>
-    <w:bookmarkStart w:id="43" w:name="X3b9c230606f020a2a758b89b839c6c3409dee2a"/>
+    <w:bookmarkEnd w:id="54"/>
+    <w:bookmarkStart w:id="58" w:name="X3b9c230606f020a2a758b89b839c6c3409dee2a"/>
     <w:p>
       <w:pPr>
         <w:pStyle w:val="Heading3"/>
@@ -11351,11 +11491,46 @@
         <w:pStyle w:val="BodyText"/>
       </w:pPr>
       <w:r>
-        <w:rPr>
-          <w:b/>
-          <w:bCs/>
-        </w:rPr>
-        <w:t xml:space="preserve">[MERMAID RENDER FAILED — block #5]</w:t>
+        <w:drawing>
+          <wp:inline>
+            <wp:extent cx="5334000" cy="1333500"/>
+            <wp:effectExtent b="0" l="0" r="0" t="0"/>
+            <wp:docPr descr="diagram" title="" id="56" name="Picture"/>
+            <a:graphic>
+              <a:graphicData uri="http://schemas.openxmlformats.org/drawingml/2006/picture">
+                <pic:pic>
+                  <pic:nvPicPr>
+                    <pic:cNvPr descr="/tmp/.private/milosvasic/tmp.gptM01fOlL/img/diagram_005_72242e5171c3.png" id="57" name="Picture"/>
+                    <pic:cNvPicPr>
+                      <a:picLocks noChangeArrowheads="1" noChangeAspect="1"/>
+                    </pic:cNvPicPr>
+                  </pic:nvPicPr>
+                  <pic:blipFill>
+                    <a:blip r:embed="rId55"/>
+                    <a:stretch>
+                      <a:fillRect/>
+                    </a:stretch>
+                  </pic:blipFill>
+                  <pic:spPr bwMode="auto">
+                    <a:xfrm>
+                      <a:off x="0" y="0"/>
+                      <a:ext cx="5334000" cy="1333500"/>
+                    </a:xfrm>
+                    <a:prstGeom prst="rect">
+                      <a:avLst/>
+                    </a:prstGeom>
+                    <a:noFill/>
+                    <a:ln w="9525">
+                      <a:noFill/>
+                      <a:headEnd/>
+                      <a:tailEnd/>
+                    </a:ln>
+                  </pic:spPr>
+                </pic:pic>
+              </a:graphicData>
+            </a:graphic>
+          </wp:inline>
+        </w:drawing>
       </w:r>
     </w:p>
     <w:p>
@@ -11365,9 +11540,9 @@
         </w:pict>
       </w:r>
     </w:p>
-    <w:bookmarkEnd w:id="43"/>
-    <w:bookmarkEnd w:id="44"/>
-    <w:bookmarkStart w:id="54" w:name="X5a314a91f6c62e379b00ceed655f7c0e267174c"/>
+    <w:bookmarkEnd w:id="58"/>
+    <w:bookmarkEnd w:id="59"/>
+    <w:bookmarkStart w:id="69" w:name="X5a314a91f6c62e379b00ceed655f7c0e267174c"/>
     <w:p>
       <w:pPr>
         <w:pStyle w:val="Heading2"/>
@@ -11505,7 +11680,7 @@
         <w:t xml:space="preserve">(the moment evidence forces the choice).</w:t>
       </w:r>
     </w:p>
-    <w:bookmarkStart w:id="45" w:name="d1--primary-obfuscating-transport"/>
+    <w:bookmarkStart w:id="60" w:name="d1--primary-obfuscating-transport"/>
     <w:p>
       <w:pPr>
         <w:pStyle w:val="Heading3"/>
@@ -11918,8 +12093,8 @@
         <w:t xml:space="preserve">≥50% of plain) — if G2 fails, re-open D1 with G2 evidence.</w:t>
       </w:r>
     </w:p>
-    <w:bookmarkEnd w:id="45"/>
-    <w:bookmarkStart w:id="46" w:name="d2--shared-client-core-language"/>
+    <w:bookmarkEnd w:id="60"/>
+    <w:bookmarkStart w:id="61" w:name="d2--shared-client-core-language"/>
     <w:p>
       <w:pPr>
         <w:pStyle w:val="Heading3"/>
@@ -12268,8 +12443,8 @@
         <w:t xml:space="preserve">the whole client strategy re-open.</w:t>
       </w:r>
     </w:p>
-    <w:bookmarkEnd w:id="46"/>
-    <w:bookmarkStart w:id="47" w:name="d3--event-bus"/>
+    <w:bookmarkEnd w:id="61"/>
+    <w:bookmarkStart w:id="62" w:name="d3--event-bus"/>
     <w:p>
       <w:pPr>
         <w:pStyle w:val="Heading3"/>
@@ -12646,8 +12821,8 @@
         <w:t xml:space="preserve">so the swap is mechanical.</w:t>
       </w:r>
     </w:p>
-    <w:bookmarkEnd w:id="47"/>
-    <w:bookmarkStart w:id="48" w:name="X092e5e8e0337537d05db01d67f1e55920b049a2"/>
+    <w:bookmarkEnd w:id="62"/>
+    <w:bookmarkStart w:id="63" w:name="X092e5e8e0337537d05db01d67f1e55920b049a2"/>
     <w:p>
       <w:pPr>
         <w:pStyle w:val="Heading3"/>
@@ -12993,8 +13168,8 @@
         <w:t xml:space="preserve">is frozen before the registry/ipam service is built.</w:t>
       </w:r>
     </w:p>
-    <w:bookmarkEnd w:id="48"/>
-    <w:bookmarkStart w:id="49" w:name="X9d7b8ed6847413c8ecdc46e155f4673fcb54dca"/>
+    <w:bookmarkEnd w:id="63"/>
+    <w:bookmarkStart w:id="64" w:name="X9d7b8ed6847413c8ecdc46e155f4673fcb54dca"/>
     <w:p>
       <w:pPr>
         <w:pStyle w:val="Heading3"/>
@@ -13335,8 +13510,8 @@
         <w:t xml:space="preserve">a shared-MASQUE drift mitigation is acceptable, D5 flips with G4 evidence.</w:t>
       </w:r>
     </w:p>
-    <w:bookmarkEnd w:id="49"/>
-    <w:bookmarkStart w:id="50" w:name="X6328fde05cfffbbad4e72638de00a5185223c79"/>
+    <w:bookmarkEnd w:id="64"/>
+    <w:bookmarkStart w:id="65" w:name="X6328fde05cfffbbad4e72638de00a5185223c79"/>
     <w:p>
       <w:pPr>
         <w:pStyle w:val="Heading3"/>
@@ -13686,8 +13861,8 @@
         <w:t xml:space="preserve">transport policy is part of the pushed desired-state.</w:t>
       </w:r>
     </w:p>
-    <w:bookmarkEnd w:id="50"/>
-    <w:bookmarkStart w:id="51" w:name="d7--mvp-ambition"/>
+    <w:bookmarkEnd w:id="65"/>
+    <w:bookmarkStart w:id="66" w:name="d7--mvp-ambition"/>
     <w:p>
       <w:pPr>
         <w:pStyle w:val="Heading3"/>
@@ -13970,8 +14145,8 @@
         <w:t xml:space="preserve">so the ambition is not silently re-inflated.</w:t>
       </w:r>
     </w:p>
-    <w:bookmarkEnd w:id="51"/>
-    <w:bookmarkStart w:id="52" w:name="d8--licensing-model"/>
+    <w:bookmarkEnd w:id="66"/>
+    <w:bookmarkStart w:id="67" w:name="d8--licensing-model"/>
     <w:p>
       <w:pPr>
         <w:pStyle w:val="Heading3"/>
@@ -14257,8 +14432,8 @@
         <w:t xml:space="preserve">license (§11.4.6).</w:t>
       </w:r>
     </w:p>
-    <w:bookmarkEnd w:id="52"/>
-    <w:bookmarkStart w:id="53" w:name="Xd72bb396e0f806504730d47d4fcca2d8b2841d4"/>
+    <w:bookmarkEnd w:id="67"/>
+    <w:bookmarkStart w:id="68" w:name="Xd72bb396e0f806504730d47d4fcca2d8b2841d4"/>
     <w:p>
       <w:pPr>
         <w:pStyle w:val="Heading3"/>
@@ -14812,9 +14987,9 @@
         </w:pict>
       </w:r>
     </w:p>
-    <w:bookmarkEnd w:id="53"/>
-    <w:bookmarkEnd w:id="54"/>
-    <w:bookmarkStart w:id="55" w:name="X3e3f831c6cfbf027d3cb310c841e9d6501a79f8"/>
+    <w:bookmarkEnd w:id="68"/>
+    <w:bookmarkEnd w:id="69"/>
+    <w:bookmarkStart w:id="70" w:name="X3e3f831c6cfbf027d3cb310c841e9d6501a79f8"/>
     <w:p>
       <w:pPr>
         <w:pStyle w:val="Heading2"/>
@@ -15201,8 +15376,8 @@
         </w:pict>
       </w:r>
     </w:p>
-    <w:bookmarkEnd w:id="55"/>
-    <w:bookmarkStart w:id="57" w:name="X8e23609dee53481e9b95b7106fda23088f1f760"/>
+    <w:bookmarkEnd w:id="70"/>
+    <w:bookmarkStart w:id="72" w:name="X8e23609dee53481e9b95b7106fda23088f1f760"/>
     <w:p>
       <w:pPr>
         <w:pStyle w:val="Heading2"/>
@@ -15550,7 +15725,7 @@
         <w:t xml:space="preserve">re-opening requires new evidence (§11.4.6/.7).</w:t>
       </w:r>
     </w:p>
-    <w:bookmarkStart w:id="56" w:name="Xd201d51d2fe291380c3dc888a888d82aabc0d45"/>
+    <w:bookmarkStart w:id="71" w:name="Xd201d51d2fe291380c3dc888a888d82aabc0d45"/>
     <w:p>
       <w:pPr>
         <w:pStyle w:val="Heading3"/>
@@ -15931,9 +16106,9 @@
         </w:pict>
       </w:r>
     </w:p>
-    <w:bookmarkEnd w:id="56"/>
-    <w:bookmarkEnd w:id="57"/>
-    <w:bookmarkStart w:id="58" w:name="sources-verified"/>
+    <w:bookmarkEnd w:id="71"/>
+    <w:bookmarkEnd w:id="72"/>
+    <w:bookmarkStart w:id="73" w:name="sources-verified"/>
     <w:p>
       <w:pPr>
         <w:pStyle w:val="Heading2"/>
@@ -16296,8 +16471,8 @@
         <w:t xml:space="preserve">Constitution bindings applied: §11.4.44 (revision header), §11.4.6 (no-guessing — open decisions carry options+recommendation, never silent picks), §11.4.66 (decision discipline), §11.4.17/.35 (universal vs project, inheritance), §11.4.76/.161 (containers/rootless), §11.4.93 (phases→workable items), §11.4.106 (docs_chain sync), §11.4.65/.153 (HTML+PDF[+DOCX] exports follow in refinement).</w:t>
       </w:r>
     </w:p>
-    <w:bookmarkEnd w:id="58"/>
-    <w:bookmarkEnd w:id="59"/>
+    <w:bookmarkEnd w:id="73"/>
+    <w:bookmarkEnd w:id="74"/>
     <w:sectPr>
       <w:footnotePr>
         <w:numRestart w:val="eachSect"/>

</xml_diff>